<commit_message>
court(ca9): complete docx engine, 96/96 on both samples (fb-595.43)
reference.docx in Times New Roman; ca9.lua generates the cover, table of
contents, table of authorities, signature block, Forms 17/8/15 and addendum;
docx/render.sh looks up pages in the LibreOffice PDF until they settle, writes
the cover/roman/arabic/Add-n footers and a reproducible archive. Gate 2 rows for
all 25 + 19 docx pages in reviews/2026-10-21.md; nothing BLOCKED.
</commit_message>
<xml_diff>
--- a/courts/ninth-circuit/court-of-appeals/docx/reference.docx
+++ b/courts/ninth-circuit/court-of-appeals/docx/reference.docx
@@ -315,9 +315,6 @@
     </w:p>
     <w:sectPr>
       <w:footerReference w:type="default" r:id="rIdFooter1"/>
-      <w:footnotePr>
-        <w:numRestart w:val="eachSect"/>
-      </w:footnotePr>
       <w:pgSz w:w="12240" w:h="15840"/>
       <w:pgMar w:top="1440" w:right="1440" w:bottom="1440" w:left="1440" w:header="720" w:footer="432" w:gutter="0"/>
     </w:sectPr>
@@ -513,7 +510,7 @@
   <w:docDefaults>
     <w:rPrDefault>
       <w:rPr>
-        <w:rFonts w:ascii="EB Garamond" w:hAnsi="EB Garamond" w:eastAsia="EB Garamond" w:cs="EB Garamond"/>
+        <w:rFonts w:ascii="Times New Roman" w:hAnsi="Times New Roman" w:eastAsia="Times New Roman" w:cs="Times New Roman"/>
         <w:sz w:val="28"/>
         <w:szCs w:val="28"/>
         <w:lang w:val="en-US" w:eastAsia="zh-CN" w:bidi="ar-SA"/>
@@ -704,7 +701,7 @@
       <w:outlineLvl w:val="0"/>
     </w:pPr>
     <w:rPr>
-      <w:rFonts w:ascii="EB Garamond" w:hAnsi="EB Garamond" w:eastAsia="EB Garamond" w:cs="EB Garamond"/>
+      <w:rFonts w:ascii="Times New Roman" w:hAnsi="Times New Roman" w:eastAsia="Times New Roman" w:cs="Times New Roman"/>
       <w:b/>
       <w:bCs/>
       <w:caps/>
@@ -731,7 +728,7 @@
       <w:outlineLvl w:val="1"/>
     </w:pPr>
     <w:rPr>
-      <w:rFonts w:ascii="EB Garamond" w:hAnsi="EB Garamond" w:eastAsia="EB Garamond" w:cs="EB Garamond"/>
+      <w:rFonts w:ascii="Times New Roman" w:hAnsi="Times New Roman" w:eastAsia="Times New Roman" w:cs="Times New Roman"/>
       <w:b/>
       <w:bCs/>
       <w:color w:val="000000"/>
@@ -757,7 +754,7 @@
       <w:outlineLvl w:val="2"/>
     </w:pPr>
     <w:rPr>
-      <w:rFonts w:ascii="EB Garamond" w:hAnsi="EB Garamond" w:eastAsia="EB Garamond" w:cs="EB Garamond"/>
+      <w:rFonts w:ascii="Times New Roman" w:hAnsi="Times New Roman" w:eastAsia="Times New Roman" w:cs="Times New Roman"/>
       <w:b/>
       <w:bCs/>
       <w:color w:val="000000"/>
@@ -783,7 +780,7 @@
       <w:outlineLvl w:val="3"/>
     </w:pPr>
     <w:rPr>
-      <w:rFonts w:ascii="EB Garamond" w:hAnsi="EB Garamond" w:eastAsia="EB Garamond" w:cs="EB Garamond"/>
+      <w:rFonts w:ascii="Times New Roman" w:hAnsi="Times New Roman" w:eastAsia="Times New Roman" w:cs="Times New Roman"/>
       <w:b/>
       <w:bCs/>
       <w:i/>
@@ -810,7 +807,7 @@
       <w:outlineLvl w:val="4"/>
     </w:pPr>
     <w:rPr>
-      <w:rFonts w:ascii="EB Garamond" w:hAnsi="EB Garamond" w:eastAsia="EB Garamond" w:cs="EB Garamond"/>
+      <w:rFonts w:ascii="Times New Roman" w:hAnsi="Times New Roman" w:eastAsia="Times New Roman" w:cs="Times New Roman"/>
       <w:b/>
       <w:bCs/>
       <w:i/>
@@ -1034,7 +1031,7 @@
     <w:unhideWhenUsed/>
     <w:qFormat/>
     <w:pPr>
-      <w:spacing w:before="0" w:after="180" w:line="399" w:lineRule="exact"/>
+      <w:spacing w:before="280" w:after="280" w:line="340" w:lineRule="exact"/>
       <w:ind w:firstLine="0" w:left="720" w:right="720"/>
     </w:pPr>
   </w:style>
@@ -1046,7 +1043,8 @@
     <w:unhideWhenUsed/>
     <w:qFormat/>
     <w:pPr>
-      <w:spacing w:before="0" w:after="120" w:line="399" w:lineRule="exact"/>
+      <w:keepLines/>
+      <w:spacing w:before="0" w:after="120" w:line="340" w:lineRule="exact"/>
     </w:pPr>
     <w:rPr>
       <w:sz w:val="28"/>
@@ -1170,7 +1168,7 @@
     <w:name w:val="Hyperlink"/>
     <w:basedOn w:val="BodyTextChar"/>
     <w:rPr>
-      <w:color w:val="4F81BD" w:themeColor="accent1"/>
+      <w:color w:val="000000"/>
     </w:rPr>
   </w:style>
   <w:style w:type="paragraph" w:styleId="TOCHeading">

</xml_diff>

<commit_message>
ca9: typst reference on the cross-engine layout model; docx follows it line for line (fb-595.54)
typst: no kerning or ligatures, greedy line breaking, fixed line boxes (baseline at 0.8 of
the pitch: 29.4 / 17 / 20 pt), spacing in points, TOC/TOA rows with a right page column,
lists with the number in a half-inch box, a ruled X check box.
docx: the same pitches, spacings, rows, lists and form layout; non-breaking hyphen before a
digit; pandoc's abbreviation no-break spaces undone; shorter fallback needles.
fb diff --engines: no-break spaces split words, trailing dots ignored.
</commit_message>
<xml_diff>
--- a/courts/ninth-circuit/court-of-appeals/docx/reference.docx
+++ b/courts/ninth-circuit/court-of-appeals/docx/reference.docx
@@ -518,6 +518,7 @@
     </w:rPrDefault>
     <w:pPrDefault>
       <w:pPr>
+        <w:widowControl/>
         <w:spacing w:after="0"/>
       </w:pPr>
     </w:pPrDefault>
@@ -533,7 +534,7 @@
     <w:link w:val="BodyTextChar"/>
     <w:qFormat/>
     <w:pPr>
-      <w:spacing w:before="0" w:after="0" w:line="629" w:lineRule="exact"/>
+      <w:spacing w:before="0" w:after="0" w:line="588" w:lineRule="exact"/>
       <w:ind w:firstLine="720"/>
     </w:pPr>
   </w:style>
@@ -1023,6 +1024,15 @@
       <w:color w:val="272727" w:themeColor="text1" w:themeTint="D8"/>
     </w:rPr>
   </w:style>
+  <w:style w:type="paragraph" w:customStyle="1" w:styleId="ListItem">
+    <w:name w:val="List Item"/>
+    <w:basedOn w:val="BodyText"/>
+    <w:qFormat/>
+    <w:pPr>
+      <w:spacing w:before="0" w:after="0" w:line="588" w:lineRule="exact"/>
+      <w:ind w:left="720" w:hanging="720"/>
+    </w:pPr>
+  </w:style>
   <w:style w:type="paragraph" w:styleId="BlockText">
     <w:name w:val="Block Text"/>
     <w:basedOn w:val="BodyText"/>
@@ -1044,7 +1054,7 @@
     <w:qFormat/>
     <w:pPr>
       <w:keepLines/>
-      <w:spacing w:before="0" w:after="120" w:line="340" w:lineRule="exact"/>
+      <w:spacing w:before="0" w:after="140" w:line="340" w:lineRule="exact"/>
     </w:pPr>
     <w:rPr>
       <w:sz w:val="28"/>
@@ -1059,8 +1069,8 @@
     <w:unhideWhenUsed/>
     <w:qFormat/>
     <w:pPr>
-      <w:spacing w:before="100" w:after="100"/>
-      <w:ind w:firstLine="0" w:left="480" w:right="480"/>
+      <w:spacing w:before="280" w:after="280"/>
+      <w:ind w:firstLine="0" w:left="720" w:right="720"/>
     </w:pPr>
   </w:style>
   <w:style w:type="character" w:default="1" w:styleId="DefaultParagraphFont">

</xml_diff>